<commit_message>
Logos correctos del hospital HRECCOS Juigalpa, gobierno y 4719
Co-Authored-By: Claude Opus 5.5 <noreply@anthropic.com>
Claude-Session: https://claude.ai/code/session_01UdPaAjDEXLYCAXPxWieUaS
</commit_message>
<xml_diff>
--- a/InformesRadiologicos/ejemplos/Paciente_Ejemplo_US_Abdominopelvico.docx
+++ b/InformesRadiologicos/ejemplos/Paciente_Ejemplo_US_Abdominopelvico.docx
@@ -48,7 +48,7 @@
             <w:r>
               <w:drawing>
                 <wp:inline xmlns:a="http://schemas.openxmlformats.org/drawingml/2006/main" xmlns:pic="http://schemas.openxmlformats.org/drawingml/2006/picture">
-                  <wp:extent cx="1368000" cy="1368000"/>
+                  <wp:extent cx="1368000" cy="1315560"/>
                   <wp:docPr id="1" name="Picture 1"/>
                   <wp:cNvGraphicFramePr>
                     <a:graphicFrameLocks noChangeAspect="1"/>
@@ -69,7 +69,7 @@
                         <pic:spPr>
                           <a:xfrm>
                             <a:off x="0" y="0"/>
-                            <a:ext cx="1368000" cy="1368000"/>
+                            <a:ext cx="1368000" cy="1315560"/>
                           </a:xfrm>
                           <a:prstGeom prst="rect"/>
                         </pic:spPr>
@@ -381,7 +381,7 @@
                 <w:color w:val="111827"/>
                 <w:sz w:val="19"/>
               </w:rPr>
-              <w:t>09:55 AM</w:t>
+              <w:t>10:04 AM</w:t>
             </w:r>
           </w:p>
           <w:p>
@@ -3578,7 +3578,7 @@
           <w:r>
             <w:drawing>
               <wp:inline xmlns:a="http://schemas.openxmlformats.org/drawingml/2006/main" xmlns:pic="http://schemas.openxmlformats.org/drawingml/2006/picture">
-                <wp:extent cx="1368000" cy="492480"/>
+                <wp:extent cx="1368000" cy="594320"/>
                 <wp:docPr id="1" name="Picture 1"/>
                 <wp:cNvGraphicFramePr>
                   <a:graphicFrameLocks noChangeAspect="1"/>
@@ -3599,7 +3599,7 @@
                       <pic:spPr>
                         <a:xfrm>
                           <a:off x="0" y="0"/>
-                          <a:ext cx="1368000" cy="492480"/>
+                          <a:ext cx="1368000" cy="594320"/>
                         </a:xfrm>
                         <a:prstGeom prst="rect"/>
                       </pic:spPr>
@@ -3788,7 +3788,7 @@
           <w:r>
             <w:drawing>
               <wp:inline xmlns:a="http://schemas.openxmlformats.org/drawingml/2006/main" xmlns:pic="http://schemas.openxmlformats.org/drawingml/2006/picture">
-                <wp:extent cx="720000" cy="531600"/>
+                <wp:extent cx="720000" cy="556800"/>
                 <wp:docPr id="2" name="Picture 2"/>
                 <wp:cNvGraphicFramePr>
                   <a:graphicFrameLocks noChangeAspect="1"/>
@@ -3809,7 +3809,7 @@
                       <pic:spPr>
                         <a:xfrm>
                           <a:off x="0" y="0"/>
-                          <a:ext cx="720000" cy="531600"/>
+                          <a:ext cx="720000" cy="556800"/>
                         </a:xfrm>
                         <a:prstGeom prst="rect"/>
                       </pic:spPr>
@@ -3879,7 +3879,7 @@
           <w:r>
             <w:drawing>
               <wp:inline xmlns:a="http://schemas.openxmlformats.org/drawingml/2006/main" xmlns:pic="http://schemas.openxmlformats.org/drawingml/2006/picture">
-                <wp:extent cx="1368000" cy="492480"/>
+                <wp:extent cx="1368000" cy="594320"/>
                 <wp:docPr id="1" name="Picture 1"/>
                 <wp:cNvGraphicFramePr>
                   <a:graphicFrameLocks noChangeAspect="1"/>
@@ -3900,7 +3900,7 @@
                       <pic:spPr>
                         <a:xfrm>
                           <a:off x="0" y="0"/>
-                          <a:ext cx="1368000" cy="492480"/>
+                          <a:ext cx="1368000" cy="594320"/>
                         </a:xfrm>
                         <a:prstGeom prst="rect"/>
                       </pic:spPr>
@@ -4089,7 +4089,7 @@
           <w:r>
             <w:drawing>
               <wp:inline xmlns:a="http://schemas.openxmlformats.org/drawingml/2006/main" xmlns:pic="http://schemas.openxmlformats.org/drawingml/2006/picture">
-                <wp:extent cx="720000" cy="531600"/>
+                <wp:extent cx="720000" cy="556800"/>
                 <wp:docPr id="2" name="Picture 2"/>
                 <wp:cNvGraphicFramePr>
                   <a:graphicFrameLocks noChangeAspect="1"/>
@@ -4110,7 +4110,7 @@
                       <pic:spPr>
                         <a:xfrm>
                           <a:off x="0" y="0"/>
-                          <a:ext cx="720000" cy="531600"/>
+                          <a:ext cx="720000" cy="556800"/>
                         </a:xfrm>
                         <a:prstGeom prst="rect"/>
                       </pic:spPr>
@@ -4163,7 +4163,7 @@
           <w:r>
             <w:drawing>
               <wp:inline xmlns:a="http://schemas.openxmlformats.org/drawingml/2006/main" xmlns:pic="http://schemas.openxmlformats.org/drawingml/2006/picture">
-                <wp:extent cx="540000" cy="540000"/>
+                <wp:extent cx="540000" cy="519300"/>
                 <wp:docPr id="1" name="Picture 1"/>
                 <wp:cNvGraphicFramePr>
                   <a:graphicFrameLocks noChangeAspect="1"/>
@@ -4184,7 +4184,7 @@
                       <pic:spPr>
                         <a:xfrm>
                           <a:off x="0" y="0"/>
-                          <a:ext cx="540000" cy="540000"/>
+                          <a:ext cx="540000" cy="519300"/>
                         </a:xfrm>
                         <a:prstGeom prst="rect"/>
                       </pic:spPr>

</xml_diff>